<commit_message>
Update report cover and add PDF edition
</commit_message>
<xml_diff>
--- a/WasteVision_AI_Project_Report.docx
+++ b/WasteVision_AI_Project_Report.docx
@@ -4,7 +4,8 @@
   <w:body>
     <w:p>
       <w:pPr>
-        <w:spacing w:before="120"/>
+        <w:spacing w:before="120" w:after="80"/>
+        <w:jc w:val="center"/>
         <w:rPr>
           <w:rFonts w:ascii="Times New Roman" w:hAnsi="Times New Roman" w:eastAsia="Times New Roman" w:cs="Times New Roman"/>
           <w:b w:val="0"/>
@@ -22,28 +23,21 @@
       </w:pPr>
       <w:r>
         <w:drawing>
-          <wp:inline wp14:editId="032B934E" wp14:anchorId="2D0A686A">
-            <wp:extent cx="6286500" cy="1009650"/>
-            <wp:effectExtent l="0" t="0" r="0" b="0"/>
-            <wp:docPr id="11750477" name="drawing"/>
+          <wp:inline>
+            <wp:extent cx="1691640" cy="1060858"/>
+            <wp:docPr id="11750483" name="Picture 11750483"/>
             <wp:cNvGraphicFramePr>
               <a:graphicFrameLocks noChangeAspect="1"/>
             </wp:cNvGraphicFramePr>
             <a:graphic>
-              <a:graphicData xmlns:a="http://schemas.openxmlformats.org/drawingml/2006/main" uri="http://schemas.openxmlformats.org/drawingml/2006/picture">
-                <pic:pic xmlns:pic="http://schemas.openxmlformats.org/drawingml/2006/picture">
+              <a:graphicData uri="http://schemas.openxmlformats.org/drawingml/2006/picture">
+                <pic:pic>
                   <pic:nvPicPr>
-                    <pic:cNvPr id="11750477" name="Picture 11750477"/>
+                    <pic:cNvPr id="0" name="image.png"/>
                     <pic:cNvPicPr/>
                   </pic:nvPicPr>
                   <pic:blipFill>
-                    <a:blip xmlns:r="http://schemas.openxmlformats.org/officeDocument/2006/relationships" r:embed="rId1488500198">
-                      <a:extLst>
-                        <a:ext uri="{28A0092B-C50C-407E-A947-70E740481C1C}">
-                          <a14:useLocalDpi xmlns:a14="http://schemas.microsoft.com/office/drawing/2010/main"/>
-                        </a:ext>
-                      </a:extLst>
-                    </a:blip>
+                    <a:blip r:embed="rId13"/>
                     <a:stretch>
                       <a:fillRect/>
                     </a:stretch>
@@ -51,11 +45,9 @@
                   <pic:spPr>
                     <a:xfrm>
                       <a:off x="0" y="0"/>
-                      <a:ext cx="6286500" cy="1009650"/>
+                      <a:ext cx="1691640" cy="1060858"/>
                     </a:xfrm>
-                    <a:prstGeom prst="rect">
-                      <a:avLst/>
-                    </a:prstGeom>
+                    <a:prstGeom prst="rect"/>
                   </pic:spPr>
                 </pic:pic>
               </a:graphicData>
@@ -89,7 +81,7 @@
     </w:p>
     <w:p>
       <w:pPr>
-        <w:spacing w:before="120"/>
+        <w:spacing w:before="0" w:after="0" w:line="20" w:lineRule="exact"/>
         <w:jc w:val="center"/>
         <w:rPr>
           <w:rFonts w:ascii="Times New Roman" w:hAnsi="Times New Roman" w:eastAsia="Times New Roman" w:cs="Times New Roman"/>
@@ -127,7 +119,7 @@
         </w:rPr>
       </w:pPr>
       <w:r>
-        <w:t>AIML · Seventh Semester</w:t>
+        <w:t>AIML · 7th Semester</w:t>
       </w:r>
     </w:p>
     <w:p>
@@ -156,7 +148,7 @@
     <w:p>
       <w:pPr>
         <w:pStyle w:val="Title"/>
-        <w:spacing w:after="0" w:afterAutospacing="off"/>
+        <w:spacing w:after="160" w:afterAutospacing="off" w:before="80"/>
         <w:jc w:val="center"/>
         <w:rPr>
           <w:rFonts w:ascii="Times New Roman" w:hAnsi="Times New Roman" w:eastAsia="Times New Roman" w:cs="Times New Roman"/>
@@ -174,12 +166,18 @@
         </w:rPr>
       </w:pPr>
       <w:r>
+        <w:rPr>
+          <w:rFonts w:ascii="Manrope" w:hAnsi="Manrope"/>
+          <w:b/>
+          <w:color w:val="143727"/>
+          <w:sz w:val="72"/>
+        </w:rPr>
         <w:t>WasteVision AI</w:t>
       </w:r>
     </w:p>
     <w:p>
       <w:pPr>
-        <w:spacing w:after="0" w:afterAutospacing="off"/>
+        <w:spacing w:after="280" w:afterAutospacing="off"/>
         <w:jc w:val="center"/>
         <w:rPr>
           <w:rFonts w:ascii="Times New Roman" w:hAnsi="Times New Roman" w:eastAsia="Times New Roman" w:cs="Times New Roman"/>
@@ -202,7 +200,7 @@
     </w:p>
     <w:p>
       <w:pPr>
-        <w:spacing w:after="480"/>
+        <w:spacing w:after="0" w:before="0" w:line="20" w:lineRule="exact"/>
         <w:jc w:val="center"/>
         <w:rPr>
           <w:rFonts w:ascii="Times New Roman" w:hAnsi="Times New Roman" w:eastAsia="Times New Roman" w:cs="Times New Roman"/>
@@ -222,7 +220,7 @@
     </w:p>
     <w:p>
       <w:pPr>
-        <w:spacing w:before="60"/>
+        <w:spacing w:before="0" w:after="0" w:line="20" w:lineRule="exact"/>
         <w:rPr>
           <w:rFonts w:ascii="Times New Roman" w:hAnsi="Times New Roman" w:eastAsia="Times New Roman" w:cs="Times New Roman"/>
           <w:b w:val="0"/>
@@ -244,6 +242,7 @@
         <w:tblStyle w:val="TableNormal"/>
         <w:bidiVisual w:val="0"/>
         <w:tblW w:w="0" w:type="auto"/>
+        <w:jc w:val="center"/>
         <w:tblBorders>
           <w:top w:val="single" w:sz="6"/>
           <w:left w:val="single" w:sz="6"/>
@@ -264,10 +263,12 @@
           <w:tcPr>
             <w:tcW w:w="2790" w:type="dxa"/>
             <w:tcBorders>
-              <w:top w:val="single" w:color="E2D9CC" w:sz="6"/>
-              <w:left w:val="single" w:color="E2D9CC" w:sz="6"/>
-              <w:bottom w:val="single" w:color="E2D9CC" w:sz="6"/>
-              <w:right w:val="single" w:color="E2D9CC" w:sz="6"/>
+              <w:top w:val="single" w:color="C9D9CE" w:sz="5"/>
+              <w:left w:val="single" w:color="C9D9CE" w:sz="5"/>
+              <w:bottom w:val="single" w:color="C9D9CE" w:sz="5"/>
+              <w:right w:val="single" w:color="C9D9CE" w:sz="5"/>
+              <w:insideH w:val="single" w:sz="5" w:color="C9D9CE"/>
+              <w:insideV w:val="single" w:sz="5" w:color="C9D9CE"/>
             </w:tcBorders>
             <w:tcMar>
               <w:top w:w="75" w:type="dxa"/>
@@ -276,9 +277,11 @@
               <w:right w:w="120" w:type="dxa"/>
             </w:tcMar>
             <w:vAlign w:val="center"/>
+            <w:shd w:fill="F3F8F4"/>
           </w:tcPr>
           <w:p>
             <w:pPr>
+              <w:spacing w:before="100" w:after="100"/>
               <w:rPr>
                 <w:rFonts w:ascii="Times New Roman" w:hAnsi="Times New Roman" w:eastAsia="Times New Roman" w:cs="Times New Roman"/>
                 <w:b w:val="0"/>
@@ -292,11 +295,12 @@
             <w:r>
               <w:rPr>
                 <w:rFonts w:ascii="Times New Roman" w:hAnsi="Times New Roman" w:eastAsia="Times New Roman" w:cs="Times New Roman"/>
-                <w:b w:val="1"/>
+                <w:b/>
                 <w:bCs w:val="1"/>
                 <w:i w:val="0"/>
                 <w:iCs w:val="0"/>
-                <w:sz w:val="22"/>
+                <w:color w:val="1C5339"/>
+                <w:sz w:val="20"/>
                 <w:szCs w:val="22"/>
                 <w:lang w:val="en-US"/>
               </w:rPr>
@@ -308,10 +312,12 @@
           <w:tcPr>
             <w:tcW w:w="7095" w:type="dxa"/>
             <w:tcBorders>
-              <w:top w:val="single" w:color="E2D9CC" w:sz="6"/>
-              <w:left w:val="single" w:color="E2D9CC" w:sz="6"/>
-              <w:bottom w:val="single" w:color="E2D9CC" w:sz="6"/>
-              <w:right w:val="single" w:color="E2D9CC" w:sz="6"/>
+              <w:top w:val="single" w:color="C9D9CE" w:sz="5"/>
+              <w:left w:val="single" w:color="C9D9CE" w:sz="5"/>
+              <w:bottom w:val="single" w:color="C9D9CE" w:sz="5"/>
+              <w:right w:val="single" w:color="C9D9CE" w:sz="5"/>
+              <w:insideH w:val="single" w:sz="5" w:color="C9D9CE"/>
+              <w:insideV w:val="single" w:sz="5" w:color="C9D9CE"/>
             </w:tcBorders>
             <w:tcMar>
               <w:top w:w="75" w:type="dxa"/>
@@ -320,9 +326,16 @@
               <w:right w:w="120" w:type="dxa"/>
             </w:tcMar>
             <w:vAlign w:val="center"/>
-          </w:tcPr>
-          <w:p>
-            <w:r>
+            <w:shd w:fill="F3F8F4"/>
+          </w:tcPr>
+          <w:p>
+            <w:pPr>
+              <w:spacing w:before="100" w:after="100"/>
+            </w:pPr>
+            <w:r>
+              <w:rPr>
+                <w:sz w:val="20"/>
+              </w:rPr>
               <w:t>WasteVision AI</w:t>
             </w:r>
           </w:p>
@@ -336,10 +349,12 @@
           <w:tcPr>
             <w:tcW w:w="2790" w:type="dxa"/>
             <w:tcBorders>
-              <w:top w:val="single" w:color="E2D9CC" w:sz="6"/>
-              <w:left w:val="single" w:color="E2D9CC" w:sz="6"/>
-              <w:bottom w:val="single" w:color="E2D9CC" w:sz="6"/>
-              <w:right w:val="single" w:color="E2D9CC" w:sz="6"/>
+              <w:top w:val="single" w:color="C9D9CE" w:sz="5"/>
+              <w:left w:val="single" w:color="C9D9CE" w:sz="5"/>
+              <w:bottom w:val="single" w:color="C9D9CE" w:sz="5"/>
+              <w:right w:val="single" w:color="C9D9CE" w:sz="5"/>
+              <w:insideH w:val="single" w:sz="5" w:color="C9D9CE"/>
+              <w:insideV w:val="single" w:sz="5" w:color="C9D9CE"/>
             </w:tcBorders>
             <w:tcMar>
               <w:top w:w="75" w:type="dxa"/>
@@ -351,6 +366,7 @@
           </w:tcPr>
           <w:p>
             <w:pPr>
+              <w:spacing w:before="100" w:after="100"/>
               <w:rPr>
                 <w:rFonts w:ascii="Times New Roman" w:hAnsi="Times New Roman" w:eastAsia="Times New Roman" w:cs="Times New Roman"/>
                 <w:b w:val="0"/>
@@ -364,11 +380,12 @@
             <w:r>
               <w:rPr>
                 <w:rFonts w:ascii="Times New Roman" w:hAnsi="Times New Roman" w:eastAsia="Times New Roman" w:cs="Times New Roman"/>
-                <w:b w:val="1"/>
+                <w:b/>
                 <w:bCs w:val="1"/>
                 <w:i w:val="0"/>
                 <w:iCs w:val="0"/>
-                <w:sz w:val="22"/>
+                <w:color w:val="1C5339"/>
+                <w:sz w:val="20"/>
                 <w:szCs w:val="22"/>
                 <w:lang w:val="en-US"/>
               </w:rPr>
@@ -380,10 +397,12 @@
           <w:tcPr>
             <w:tcW w:w="7095" w:type="dxa"/>
             <w:tcBorders>
-              <w:top w:val="single" w:color="E2D9CC" w:sz="6"/>
-              <w:left w:val="single" w:color="E2D9CC" w:sz="6"/>
-              <w:bottom w:val="single" w:color="E2D9CC" w:sz="6"/>
-              <w:right w:val="single" w:color="E2D9CC" w:sz="6"/>
+              <w:top w:val="single" w:color="C9D9CE" w:sz="5"/>
+              <w:left w:val="single" w:color="C9D9CE" w:sz="5"/>
+              <w:bottom w:val="single" w:color="C9D9CE" w:sz="5"/>
+              <w:right w:val="single" w:color="C9D9CE" w:sz="5"/>
+              <w:insideH w:val="single" w:sz="5" w:color="C9D9CE"/>
+              <w:insideV w:val="single" w:sz="5" w:color="C9D9CE"/>
             </w:tcBorders>
             <w:tcMar>
               <w:top w:w="75" w:type="dxa"/>
@@ -394,8 +413,64 @@
             <w:vAlign w:val="center"/>
           </w:tcPr>
           <w:p>
-            <w:r>
+            <w:pPr>
+              <w:spacing w:before="100" w:after="100"/>
+            </w:pPr>
+            <w:r>
+              <w:rPr>
+                <w:sz w:val="20"/>
+              </w:rPr>
               <w:t>Environmental sustainability and waste management</w:t>
+            </w:r>
+          </w:p>
+        </w:tc>
+      </w:tr>
+      <w:tr>
+        <w:tc>
+          <w:tcPr>
+            <w:tcW w:type="dxa" w:w="2790"/>
+            <w:tcBorders>
+              <w:top w:val="single" w:sz="5" w:color="C9D9CE"/>
+              <w:left w:val="single" w:sz="5" w:color="C9D9CE"/>
+              <w:bottom w:val="single" w:sz="5" w:color="C9D9CE"/>
+              <w:right w:val="single" w:sz="5" w:color="C9D9CE"/>
+              <w:insideH w:val="single" w:sz="5" w:color="C9D9CE"/>
+              <w:insideV w:val="single" w:sz="5" w:color="C9D9CE"/>
+            </w:tcBorders>
+            <w:shd w:fill="F3F8F4"/>
+            <w:vAlign w:val="center"/>
+          </w:tcPr>
+          <w:p>
+            <w:pPr>
+              <w:spacing w:before="100" w:after="100"/>
+            </w:pPr>
+            <w:r>
+              <w:rPr>
+                <w:b/>
+                <w:color w:val="1C5339"/>
+                <w:sz w:val="20"/>
+              </w:rPr>
+              <w:t>Subject</w:t>
+            </w:r>
+          </w:p>
+        </w:tc>
+        <w:tc>
+          <w:tcPr>
+            <w:tcW w:type="dxa" w:w="7095"/>
+            <w:tcBorders>
+              <w:top w:val="single" w:sz="5" w:color="C9D9CE"/>
+              <w:left w:val="single" w:sz="5" w:color="C9D9CE"/>
+              <w:bottom w:val="single" w:sz="5" w:color="C9D9CE"/>
+              <w:right w:val="single" w:sz="5" w:color="C9D9CE"/>
+              <w:insideH w:val="single" w:sz="5" w:color="C9D9CE"/>
+              <w:insideV w:val="single" w:sz="5" w:color="C9D9CE"/>
+            </w:tcBorders>
+            <w:shd w:fill="F3F8F4"/>
+            <w:vAlign w:val="center"/>
+          </w:tcPr>
+          <w:p>
+            <w:r>
+              <w:t>Image Analytics using Computer Vision AML23701</w:t>
             </w:r>
           </w:p>
         </w:tc>
@@ -404,7 +479,7 @@
     <w:p>
       <w:pPr>
         <w:bidi w:val="0"/>
-        <w:spacing w:before="120"/>
+        <w:spacing w:before="0" w:after="0" w:line="20" w:lineRule="exact"/>
         <w:jc w:val="center"/>
         <w:rPr>
           <w:rFonts w:ascii="Times New Roman" w:hAnsi="Times New Roman" w:eastAsia="Times New Roman" w:cs="Times New Roman"/>
@@ -425,7 +500,7 @@
     <w:p>
       <w:pPr>
         <w:bidi w:val="0"/>
-        <w:spacing w:before="120"/>
+        <w:spacing w:before="120" w:after="120"/>
         <w:jc w:val="center"/>
         <w:rPr>
           <w:rFonts w:ascii="Times New Roman" w:hAnsi="Times New Roman" w:eastAsia="Times New Roman" w:cs="Times New Roman"/>
@@ -443,19 +518,26 @@
         </w:rPr>
       </w:pPr>
       <w:r>
+        <w:rPr>
+          <w:b/>
+          <w:sz w:val="24"/>
+        </w:rPr>
         <w:t>Submitted by</w:t>
       </w:r>
       <w:r>
         <w:br/>
       </w:r>
       <w:r>
+        <w:rPr>
+          <w:sz w:val="22"/>
+        </w:rPr>
         <w:t>Guide: Prof. Vijaya Dalawai</w:t>
       </w:r>
     </w:p>
     <w:p>
       <w:pPr>
         <w:bidi w:val="0"/>
-        <w:spacing w:before="120"/>
+        <w:spacing w:before="0" w:after="0" w:line="20" w:lineRule="exact"/>
         <w:rPr>
           <w:rFonts w:ascii="Times New Roman" w:hAnsi="Times New Roman" w:eastAsia="Times New Roman" w:cs="Times New Roman"/>
           <w:b w:val="0"/>
@@ -499,18 +581,136 @@
         </w:trPr>
         <w:tc>
           <w:tcPr>
-            <w:tcW w:w="690" w:type="dxa"/>
+            <w:tcW w:w="1800" w:type="dxa"/>
             <w:tcMar>
               <w:top w:w="75" w:type="dxa"/>
               <w:left w:w="120" w:type="dxa"/>
               <w:bottom w:w="75" w:type="dxa"/>
               <w:right w:w="120" w:type="dxa"/>
             </w:tcMar>
-            <w:vAlign w:val="top"/>
+            <w:vAlign w:val="center"/>
+            <w:tcBorders>
+              <w:top w:val="single" w:sz="5" w:color="C9D9CE"/>
+              <w:left w:val="single" w:sz="5" w:color="C9D9CE"/>
+              <w:bottom w:val="single" w:sz="5" w:color="C9D9CE"/>
+              <w:right w:val="single" w:sz="5" w:color="C9D9CE"/>
+              <w:insideH w:val="single" w:sz="5" w:color="C9D9CE"/>
+              <w:insideV w:val="single" w:sz="5" w:color="C9D9CE"/>
+            </w:tcBorders>
+            <w:shd w:fill="1D6846"/>
+          </w:tcPr>
+          <w:p>
+            <w:pPr>
+              <w:spacing w:before="80" w:after="80"/>
+              <w:jc w:val="center"/>
+            </w:pPr>
+            <w:r>
+              <w:rPr>
+                <w:b/>
+                <w:color w:val="FFFFFF"/>
+                <w:sz w:val="20"/>
+              </w:rPr>
+              <w:t>Team Member</w:t>
+            </w:r>
+          </w:p>
+        </w:tc>
+        <w:tc>
+          <w:tcPr>
+            <w:tcW w:w="4608" w:type="dxa"/>
+            <w:tcMar>
+              <w:top w:w="75" w:type="dxa"/>
+              <w:left w:w="120" w:type="dxa"/>
+              <w:bottom w:w="75" w:type="dxa"/>
+              <w:right w:w="120" w:type="dxa"/>
+            </w:tcMar>
+            <w:vAlign w:val="center"/>
+            <w:tcBorders>
+              <w:top w:val="single" w:sz="5" w:color="C9D9CE"/>
+              <w:left w:val="single" w:sz="5" w:color="C9D9CE"/>
+              <w:bottom w:val="single" w:sz="5" w:color="C9D9CE"/>
+              <w:right w:val="single" w:sz="5" w:color="C9D9CE"/>
+              <w:insideH w:val="single" w:sz="5" w:color="C9D9CE"/>
+              <w:insideV w:val="single" w:sz="5" w:color="C9D9CE"/>
+            </w:tcBorders>
+            <w:shd w:fill="1D6846"/>
+          </w:tcPr>
+          <w:p>
+            <w:pPr>
+              <w:spacing w:before="80" w:after="80"/>
+            </w:pPr>
+            <w:r>
+              <w:rPr>
+                <w:b/>
+                <w:color w:val="FFFFFF"/>
+                <w:sz w:val="20"/>
+              </w:rPr>
+              <w:t>Name</w:t>
+            </w:r>
+          </w:p>
+        </w:tc>
+        <w:tc>
+          <w:tcPr>
+            <w:tcW w:w="2880" w:type="dxa"/>
+            <w:tcMar>
+              <w:top w:w="75" w:type="dxa"/>
+              <w:left w:w="120" w:type="dxa"/>
+              <w:bottom w:w="75" w:type="dxa"/>
+              <w:right w:w="120" w:type="dxa"/>
+            </w:tcMar>
+            <w:vAlign w:val="center"/>
+            <w:tcBorders>
+              <w:top w:val="single" w:sz="5" w:color="C9D9CE"/>
+              <w:left w:val="single" w:sz="5" w:color="C9D9CE"/>
+              <w:bottom w:val="single" w:sz="5" w:color="C9D9CE"/>
+              <w:right w:val="single" w:sz="5" w:color="C9D9CE"/>
+              <w:insideH w:val="single" w:sz="5" w:color="C9D9CE"/>
+              <w:insideV w:val="single" w:sz="5" w:color="C9D9CE"/>
+            </w:tcBorders>
+            <w:shd w:fill="1D6846"/>
+          </w:tcPr>
+          <w:p>
+            <w:pPr>
+              <w:spacing w:before="80" w:after="80"/>
+              <w:jc w:val="center"/>
+            </w:pPr>
+            <w:r>
+              <w:rPr>
+                <w:b/>
+                <w:color w:val="FFFFFF"/>
+                <w:sz w:val="20"/>
+              </w:rPr>
+              <w:t>USN</w:t>
+            </w:r>
+          </w:p>
+        </w:tc>
+      </w:tr>
+      <w:tr>
+        <w:trPr>
+          <w:trHeight w:val="300"/>
+        </w:trPr>
+        <w:tc>
+          <w:tcPr>
+            <w:tcW w:w="1800" w:type="dxa"/>
+            <w:tcMar>
+              <w:top w:w="75" w:type="dxa"/>
+              <w:left w:w="120" w:type="dxa"/>
+              <w:bottom w:w="75" w:type="dxa"/>
+              <w:right w:w="120" w:type="dxa"/>
+            </w:tcMar>
+            <w:vAlign w:val="center"/>
+            <w:tcBorders>
+              <w:top w:val="single" w:sz="5" w:color="C9D9CE"/>
+              <w:left w:val="single" w:sz="5" w:color="C9D9CE"/>
+              <w:bottom w:val="single" w:sz="5" w:color="C9D9CE"/>
+              <w:right w:val="single" w:sz="5" w:color="C9D9CE"/>
+              <w:insideH w:val="single" w:sz="5" w:color="C9D9CE"/>
+              <w:insideV w:val="single" w:sz="5" w:color="C9D9CE"/>
+            </w:tcBorders>
           </w:tcPr>
           <w:p>
             <w:pPr>
               <w:bidi w:val="0"/>
+              <w:spacing w:before="80" w:after="80"/>
               <w:jc w:val="center"/>
               <w:rPr>
                 <w:rFonts w:ascii="Times New Roman" w:hAnsi="Times New Roman" w:eastAsia="Times New Roman" w:cs="Times New Roman"/>
@@ -522,39 +722,81 @@
                 <w:szCs w:val="22"/>
               </w:rPr>
             </w:pPr>
-          </w:p>
-        </w:tc>
-        <w:tc>
-          <w:tcPr>
-            <w:tcW w:w="3285" w:type="dxa"/>
+            <w:r>
+              <w:rPr>
+                <w:rFonts w:ascii="Times New Roman" w:hAnsi="Times New Roman" w:eastAsia="Times New Roman" w:cs="Times New Roman"/>
+                <w:b w:val="0"/>
+                <w:bCs w:val="0"/>
+                <w:i w:val="0"/>
+                <w:iCs w:val="0"/>
+                <w:sz w:val="20"/>
+                <w:szCs w:val="22"/>
+                <w:lang w:val="en-US"/>
+              </w:rPr>
+              <w:t>1</w:t>
+            </w:r>
+          </w:p>
+        </w:tc>
+        <w:tc>
+          <w:tcPr>
+            <w:tcW w:w="4608" w:type="dxa"/>
             <w:tcMar>
               <w:top w:w="75" w:type="dxa"/>
               <w:left w:w="120" w:type="dxa"/>
               <w:bottom w:w="75" w:type="dxa"/>
               <w:right w:w="120" w:type="dxa"/>
             </w:tcMar>
-            <w:vAlign w:val="top"/>
-          </w:tcPr>
-          <w:p>
-            <w:r>
-              <w:t>Name</w:t>
-            </w:r>
-          </w:p>
-        </w:tc>
-        <w:tc>
-          <w:tcPr>
-            <w:tcW w:w="2790" w:type="dxa"/>
+            <w:vAlign w:val="center"/>
+            <w:tcBorders>
+              <w:top w:val="single" w:sz="5" w:color="C9D9CE"/>
+              <w:left w:val="single" w:sz="5" w:color="C9D9CE"/>
+              <w:bottom w:val="single" w:sz="5" w:color="C9D9CE"/>
+              <w:right w:val="single" w:sz="5" w:color="C9D9CE"/>
+              <w:insideH w:val="single" w:sz="5" w:color="C9D9CE"/>
+              <w:insideV w:val="single" w:sz="5" w:color="C9D9CE"/>
+            </w:tcBorders>
+          </w:tcPr>
+          <w:p>
+            <w:pPr>
+              <w:spacing w:before="80" w:after="80"/>
+            </w:pPr>
+            <w:r>
+              <w:rPr>
+                <w:sz w:val="20"/>
+              </w:rPr>
+              <w:t>Aditi S Yaranal</w:t>
+            </w:r>
+          </w:p>
+        </w:tc>
+        <w:tc>
+          <w:tcPr>
+            <w:tcW w:w="2880" w:type="dxa"/>
             <w:tcMar>
               <w:top w:w="75" w:type="dxa"/>
               <w:left w:w="120" w:type="dxa"/>
               <w:bottom w:w="75" w:type="dxa"/>
               <w:right w:w="120" w:type="dxa"/>
             </w:tcMar>
-            <w:vAlign w:val="top"/>
-          </w:tcPr>
-          <w:p>
-            <w:r>
-              <w:t>USN</w:t>
+            <w:vAlign w:val="center"/>
+            <w:tcBorders>
+              <w:top w:val="single" w:sz="5" w:color="C9D9CE"/>
+              <w:left w:val="single" w:sz="5" w:color="C9D9CE"/>
+              <w:bottom w:val="single" w:sz="5" w:color="C9D9CE"/>
+              <w:right w:val="single" w:sz="5" w:color="C9D9CE"/>
+              <w:insideH w:val="single" w:sz="5" w:color="C9D9CE"/>
+              <w:insideV w:val="single" w:sz="5" w:color="C9D9CE"/>
+            </w:tcBorders>
+          </w:tcPr>
+          <w:p>
+            <w:pPr>
+              <w:spacing w:before="80" w:after="80"/>
+              <w:jc w:val="center"/>
+            </w:pPr>
+            <w:r>
+              <w:rPr>
+                <w:sz w:val="20"/>
+              </w:rPr>
+              <w:t>1GA23AI003</w:t>
             </w:r>
           </w:p>
         </w:tc>
@@ -565,18 +807,29 @@
         </w:trPr>
         <w:tc>
           <w:tcPr>
-            <w:tcW w:w="690" w:type="dxa"/>
+            <w:tcW w:w="1800" w:type="dxa"/>
             <w:tcMar>
               <w:top w:w="75" w:type="dxa"/>
               <w:left w:w="120" w:type="dxa"/>
               <w:bottom w:w="75" w:type="dxa"/>
               <w:right w:w="120" w:type="dxa"/>
             </w:tcMar>
-            <w:vAlign w:val="top"/>
+            <w:vAlign w:val="center"/>
+            <w:tcBorders>
+              <w:top w:val="single" w:sz="5" w:color="C9D9CE"/>
+              <w:left w:val="single" w:sz="5" w:color="C9D9CE"/>
+              <w:bottom w:val="single" w:sz="5" w:color="C9D9CE"/>
+              <w:right w:val="single" w:sz="5" w:color="C9D9CE"/>
+              <w:insideH w:val="single" w:sz="5" w:color="C9D9CE"/>
+              <w:insideV w:val="single" w:sz="5" w:color="C9D9CE"/>
+            </w:tcBorders>
+            <w:shd w:fill="F3F8F4"/>
           </w:tcPr>
           <w:p>
             <w:pPr>
               <w:bidi w:val="0"/>
+              <w:spacing w:before="80" w:after="80"/>
+              <w:jc w:val="center"/>
               <w:rPr>
                 <w:rFonts w:ascii="Times New Roman" w:hAnsi="Times New Roman" w:eastAsia="Times New Roman" w:cs="Times New Roman"/>
                 <w:b w:val="0"/>
@@ -594,122 +847,75 @@
                 <w:bCs w:val="0"/>
                 <w:i w:val="0"/>
                 <w:iCs w:val="0"/>
-                <w:sz w:val="22"/>
+                <w:sz w:val="20"/>
                 <w:szCs w:val="22"/>
                 <w:lang w:val="en-US"/>
               </w:rPr>
-              <w:t>1</w:t>
-            </w:r>
-          </w:p>
-        </w:tc>
-        <w:tc>
-          <w:tcPr>
-            <w:tcW w:w="3285" w:type="dxa"/>
+              <w:t>2</w:t>
+            </w:r>
+          </w:p>
+        </w:tc>
+        <w:tc>
+          <w:tcPr>
+            <w:tcW w:w="4608" w:type="dxa"/>
             <w:tcMar>
               <w:top w:w="75" w:type="dxa"/>
               <w:left w:w="120" w:type="dxa"/>
               <w:bottom w:w="75" w:type="dxa"/>
               <w:right w:w="120" w:type="dxa"/>
             </w:tcMar>
-            <w:vAlign w:val="top"/>
-          </w:tcPr>
-          <w:p>
-            <w:r>
-              <w:t>Aditi S Yaranal</w:t>
-            </w:r>
-          </w:p>
-        </w:tc>
-        <w:tc>
-          <w:tcPr>
-            <w:tcW w:w="2790" w:type="dxa"/>
+            <w:vAlign w:val="center"/>
+            <w:tcBorders>
+              <w:top w:val="single" w:sz="5" w:color="C9D9CE"/>
+              <w:left w:val="single" w:sz="5" w:color="C9D9CE"/>
+              <w:bottom w:val="single" w:sz="5" w:color="C9D9CE"/>
+              <w:right w:val="single" w:sz="5" w:color="C9D9CE"/>
+              <w:insideH w:val="single" w:sz="5" w:color="C9D9CE"/>
+              <w:insideV w:val="single" w:sz="5" w:color="C9D9CE"/>
+            </w:tcBorders>
+            <w:shd w:fill="F3F8F4"/>
+          </w:tcPr>
+          <w:p>
+            <w:pPr>
+              <w:spacing w:before="80" w:after="80"/>
+            </w:pPr>
+            <w:r>
+              <w:rPr>
+                <w:sz w:val="20"/>
+              </w:rPr>
+              <w:t>Adhisha Sreedith</w:t>
+            </w:r>
+          </w:p>
+        </w:tc>
+        <w:tc>
+          <w:tcPr>
+            <w:tcW w:w="2880" w:type="dxa"/>
             <w:tcMar>
               <w:top w:w="75" w:type="dxa"/>
               <w:left w:w="120" w:type="dxa"/>
               <w:bottom w:w="75" w:type="dxa"/>
               <w:right w:w="120" w:type="dxa"/>
             </w:tcMar>
-            <w:vAlign w:val="top"/>
-          </w:tcPr>
-          <w:p>
-            <w:r>
-              <w:t>1GA23AI003</w:t>
-            </w:r>
-          </w:p>
-        </w:tc>
-      </w:tr>
-      <w:tr>
-        <w:trPr>
-          <w:trHeight w:val="300"/>
-        </w:trPr>
-        <w:tc>
-          <w:tcPr>
-            <w:tcW w:w="690" w:type="dxa"/>
-            <w:tcMar>
-              <w:top w:w="75" w:type="dxa"/>
-              <w:left w:w="120" w:type="dxa"/>
-              <w:bottom w:w="75" w:type="dxa"/>
-              <w:right w:w="120" w:type="dxa"/>
-            </w:tcMar>
-            <w:vAlign w:val="top"/>
+            <w:vAlign w:val="center"/>
+            <w:tcBorders>
+              <w:top w:val="single" w:sz="5" w:color="C9D9CE"/>
+              <w:left w:val="single" w:sz="5" w:color="C9D9CE"/>
+              <w:bottom w:val="single" w:sz="5" w:color="C9D9CE"/>
+              <w:right w:val="single" w:sz="5" w:color="C9D9CE"/>
+              <w:insideH w:val="single" w:sz="5" w:color="C9D9CE"/>
+              <w:insideV w:val="single" w:sz="5" w:color="C9D9CE"/>
+            </w:tcBorders>
+            <w:shd w:fill="F3F8F4"/>
           </w:tcPr>
           <w:p>
             <w:pPr>
-              <w:bidi w:val="0"/>
-              <w:rPr>
-                <w:rFonts w:ascii="Times New Roman" w:hAnsi="Times New Roman" w:eastAsia="Times New Roman" w:cs="Times New Roman"/>
-                <w:b w:val="0"/>
-                <w:bCs w:val="0"/>
-                <w:i w:val="0"/>
-                <w:iCs w:val="0"/>
-                <w:sz w:val="22"/>
-                <w:szCs w:val="22"/>
-              </w:rPr>
+              <w:spacing w:before="80" w:after="80"/>
+              <w:jc w:val="center"/>
             </w:pPr>
             <w:r>
               <w:rPr>
-                <w:rFonts w:ascii="Times New Roman" w:hAnsi="Times New Roman" w:eastAsia="Times New Roman" w:cs="Times New Roman"/>
-                <w:b w:val="0"/>
-                <w:bCs w:val="0"/>
-                <w:i w:val="0"/>
-                <w:iCs w:val="0"/>
-                <w:sz w:val="22"/>
-                <w:szCs w:val="22"/>
-                <w:lang w:val="en-US"/>
-              </w:rPr>
-              <w:t>2</w:t>
-            </w:r>
-          </w:p>
-        </w:tc>
-        <w:tc>
-          <w:tcPr>
-            <w:tcW w:w="3285" w:type="dxa"/>
-            <w:tcMar>
-              <w:top w:w="75" w:type="dxa"/>
-              <w:left w:w="120" w:type="dxa"/>
-              <w:bottom w:w="75" w:type="dxa"/>
-              <w:right w:w="120" w:type="dxa"/>
-            </w:tcMar>
-            <w:vAlign w:val="top"/>
-          </w:tcPr>
-          <w:p>
-            <w:r>
-              <w:t>Adhisha Sreedith</w:t>
-            </w:r>
-          </w:p>
-        </w:tc>
-        <w:tc>
-          <w:tcPr>
-            <w:tcW w:w="2790" w:type="dxa"/>
-            <w:tcMar>
-              <w:top w:w="75" w:type="dxa"/>
-              <w:left w:w="120" w:type="dxa"/>
-              <w:bottom w:w="75" w:type="dxa"/>
-              <w:right w:w="120" w:type="dxa"/>
-            </w:tcMar>
-            <w:vAlign w:val="top"/>
-          </w:tcPr>
-          <w:p>
-            <w:r>
+                <w:sz w:val="20"/>
+              </w:rPr>
               <w:t>1GA23AI002</w:t>
             </w:r>
           </w:p>
@@ -718,22 +924,30 @@
     </w:tbl>
     <w:p>
       <w:pPr>
+        <w:pageBreakBefore w:val="0"/>
         <w:bidi w:val="0"/>
-        <w:rPr>
-          <w:rFonts w:ascii="Times New Roman" w:hAnsi="Times New Roman" w:eastAsia="Times New Roman" w:cs="Times New Roman"/>
-        </w:rPr>
-      </w:pPr>
-      <w:r>
-        <w:t>Department of Artificial Intelligence and Machine Learning · Seventh Semester</w:t>
+        <w:spacing w:before="80" w:after="0"/>
+        <w:jc w:val="center"/>
+        <w:rPr>
+          <w:rFonts w:ascii="Times New Roman" w:hAnsi="Times New Roman" w:eastAsia="Times New Roman" w:cs="Times New Roman"/>
+        </w:rPr>
+      </w:pPr>
+      <w:r>
+        <w:rPr>
+          <w:sz w:val="18"/>
+        </w:rPr>
+        <w:t>Department of Artificial Intelligence and Machine Learning · 7th Semester</w:t>
       </w:r>
     </w:p>
     <w:p>
       <w:pPr>
         <w:pStyle w:val="Heading1"/>
+        <w:pageBreakBefore/>
         <w:pBdr>
           <w:bottom w:val="single" w:color="B56B6B" w:sz="6" w:space="4"/>
         </w:pBdr>
         <w:spacing w:before="320" w:after="160"/>
+        <w:jc w:val="center"/>
         <w:rPr>
           <w:rFonts w:ascii="Times New Roman" w:hAnsi="Times New Roman" w:eastAsia="Times New Roman" w:cs="Times New Roman"/>
           <w:b w:val="1"/>
@@ -752,7 +966,7 @@
       <w:r>
         <w:rPr>
           <w:rFonts w:ascii="Times New Roman" w:hAnsi="Times New Roman" w:eastAsia="Times New Roman" w:cs="Times New Roman"/>
-          <w:b w:val="1"/>
+          <w:b/>
           <w:bCs w:val="1"/>
           <w:i w:val="0"/>
           <w:iCs w:val="0"/>
@@ -760,7 +974,7 @@
           <w:smallCaps w:val="0"/>
           <w:noProof w:val="0"/>
           <w:color w:val="auto"/>
-          <w:sz w:val="36"/>
+          <w:sz w:val="40"/>
           <w:szCs w:val="36"/>
           <w:lang w:val="en-US"/>
         </w:rPr>
@@ -768,74 +982,77 @@
       </w:r>
     </w:p>
     <w:p>
+      <w:pPr>
+        <w:pageBreakBefore w:val="0"/>
+      </w:pPr>
+      <w:r>
+        <w:t>1. Project Overview</w:t>
+      </w:r>
+    </w:p>
+    <w:p>
       <w:pPr/>
       <w:r>
-        <w:t>1. Project Overview</w:t>
+        <w:t>2. Input Data and Model Preparation</w:t>
       </w:r>
     </w:p>
     <w:p>
       <w:pPr/>
       <w:r>
-        <w:t>2. Input Data and Model Preparation</w:t>
+        <w:t>3. System Architecture</w:t>
       </w:r>
     </w:p>
     <w:p>
       <w:pPr/>
       <w:r>
-        <w:t>3. System Architecture</w:t>
+        <w:t>4. Implementation Details</w:t>
       </w:r>
     </w:p>
     <w:p>
       <w:pPr/>
       <w:r>
-        <w:t>4. Implementation Details</w:t>
+        <w:t>5. Test Sheet: Sample Scenarios and Outputs</w:t>
       </w:r>
     </w:p>
     <w:p>
       <w:pPr/>
       <w:r>
-        <w:t>5. Test Sheet: Sample Scenarios and Outputs</w:t>
+        <w:t>6. Evaluation</w:t>
       </w:r>
     </w:p>
     <w:p>
       <w:pPr/>
       <w:r>
-        <w:t>6. Evaluation</w:t>
+        <w:t>7. Failure Case Analysis</w:t>
       </w:r>
     </w:p>
     <w:p>
       <w:pPr/>
       <w:r>
-        <w:t>7. Failure Case Analysis</w:t>
+        <w:t>8. Limitations and Future Scope</w:t>
       </w:r>
     </w:p>
     <w:p>
       <w:pPr/>
       <w:r>
-        <w:t>8. Limitations and Future Scope</w:t>
+        <w:t>9. Learnings and Reflection</w:t>
       </w:r>
     </w:p>
     <w:p>
       <w:pPr/>
       <w:r>
-        <w:t>9. Learnings and Reflection</w:t>
+        <w:t>10. Use of AI Tools Disclosure</w:t>
       </w:r>
     </w:p>
     <w:p>
       <w:pPr/>
       <w:r>
-        <w:t>10. Use of AI Tools Disclosure</w:t>
-      </w:r>
-    </w:p>
-    <w:p>
-      <w:pPr/>
-      <w:r>
         <w:t>Appendix A. Interface Evidence</w:t>
       </w:r>
     </w:p>
     <w:p>
       <w:pPr>
         <w:pStyle w:val="Heading2"/>
+        <w:pageBreakBefore/>
         <w:rPr>
           <w:rFonts w:ascii="Times New Roman" w:hAnsi="Times New Roman" w:eastAsia="Times New Roman" w:cs="Times New Roman"/>
         </w:rPr>
@@ -2372,6 +2589,7 @@
       <w:tr>
         <w:trPr>
           <w:tblHeader/>
+          <w:cantSplit/>
         </w:trPr>
         <w:tc>
           <w:tcPr>
@@ -2455,6 +2673,9 @@
         </w:tc>
       </w:tr>
       <w:tr>
+        <w:trPr>
+          <w:cantSplit/>
+        </w:trPr>
         <w:tc>
           <w:tcPr>
             <w:tcW w:w="1872" w:type="dxa"/>
@@ -2532,6 +2753,9 @@
         </w:tc>
       </w:tr>
       <w:tr>
+        <w:trPr>
+          <w:cantSplit/>
+        </w:trPr>
         <w:tc>
           <w:tcPr>
             <w:tcW w:w="1872" w:type="dxa"/>
@@ -2609,6 +2833,9 @@
         </w:tc>
       </w:tr>
       <w:tr>
+        <w:trPr>
+          <w:cantSplit/>
+        </w:trPr>
         <w:tc>
           <w:tcPr>
             <w:tcW w:w="1872" w:type="dxa"/>
@@ -2686,6 +2913,9 @@
         </w:tc>
       </w:tr>
       <w:tr>
+        <w:trPr>
+          <w:cantSplit/>
+        </w:trPr>
         <w:tc>
           <w:tcPr>
             <w:tcW w:w="1872" w:type="dxa"/>
@@ -2763,6 +2993,9 @@
         </w:tc>
       </w:tr>
       <w:tr>
+        <w:trPr>
+          <w:cantSplit/>
+        </w:trPr>
         <w:tc>
           <w:tcPr>
             <w:tcW w:w="1872" w:type="dxa"/>
@@ -3575,10 +3808,8 @@
       <w:r>
         <w:t>AI tools disclosure: ChatGPT was used to assist with code review, debugging, and report drafting. The application itself does not call a generative LLM; scanning uses an object-detection model and segregation uses explicit rules.</w:t>
       </w:r>
-    </w:p>
-    <w:p>
-      <w:r>
-        <w:t xml:space="preserve">Project repository: </w:t>
+      <w:r>
+        <w:t xml:space="preserve"> Project repository: </w:t>
       </w:r>
       <w:hyperlink r:id="rId7">
         <w:r>

</xml_diff>

<commit_message>
Fix report contents and page references
</commit_message>
<xml_diff>
--- a/WasteVision_AI_Project_Report.docx
+++ b/WasteVision_AI_Project_Report.docx
@@ -524,15 +524,6 @@
         </w:rPr>
         <w:t>Submitted by</w:t>
       </w:r>
-      <w:r>
-        <w:br/>
-      </w:r>
-      <w:r>
-        <w:rPr>
-          <w:sz w:val="22"/>
-        </w:rPr>
-        <w:t>Guide: Prof. Vijaya Dalawai</w:t>
-      </w:r>
     </w:p>
     <w:p>
       <w:pPr>
@@ -943,9 +934,6 @@
       <w:pPr>
         <w:pStyle w:val="Heading1"/>
         <w:pageBreakBefore/>
-        <w:pBdr>
-          <w:bottom w:val="single" w:color="B56B6B" w:sz="6" w:space="4"/>
-        </w:pBdr>
         <w:spacing w:before="320" w:after="160"/>
         <w:jc w:val="center"/>
         <w:rPr>
@@ -965,7 +953,7 @@
       </w:pPr>
       <w:r>
         <w:rPr>
-          <w:rFonts w:ascii="Times New Roman" w:hAnsi="Times New Roman" w:eastAsia="Times New Roman" w:cs="Times New Roman"/>
+          <w:rFonts w:ascii="Aptos" w:hAnsi="Aptos" w:eastAsia="Times New Roman" w:cs="Times New Roman"/>
           <w:b/>
           <w:bCs w:val="1"/>
           <w:i w:val="0"/>
@@ -973,82 +961,669 @@
           <w:caps w:val="0"/>
           <w:smallCaps w:val="0"/>
           <w:noProof w:val="0"/>
-          <w:color w:val="auto"/>
-          <w:sz w:val="40"/>
+          <w:color w:val="1C5339"/>
+          <w:sz w:val="28"/>
           <w:szCs w:val="36"/>
           <w:lang w:val="en-US"/>
         </w:rPr>
         <w:t>Table of Contents</w:t>
       </w:r>
     </w:p>
-    <w:p>
-      <w:pPr>
-        <w:pageBreakBefore w:val="0"/>
-      </w:pPr>
-      <w:r>
-        <w:t>1. Project Overview</w:t>
-      </w:r>
-    </w:p>
-    <w:p>
-      <w:pPr/>
-      <w:r>
-        <w:t>2. Input Data and Model Preparation</w:t>
-      </w:r>
-    </w:p>
-    <w:p>
-      <w:pPr/>
-      <w:r>
-        <w:t>3. System Architecture</w:t>
-      </w:r>
-    </w:p>
-    <w:p>
-      <w:pPr/>
-      <w:r>
-        <w:t>4. Implementation Details</w:t>
-      </w:r>
-    </w:p>
-    <w:p>
-      <w:pPr/>
-      <w:r>
-        <w:t>5. Test Sheet: Sample Scenarios and Outputs</w:t>
-      </w:r>
-    </w:p>
-    <w:p>
-      <w:pPr/>
-      <w:r>
-        <w:t>6. Evaluation</w:t>
-      </w:r>
-    </w:p>
-    <w:p>
-      <w:pPr/>
-      <w:r>
-        <w:t>7. Failure Case Analysis</w:t>
-      </w:r>
-    </w:p>
-    <w:p>
-      <w:pPr/>
-      <w:r>
-        <w:t>8. Limitations and Future Scope</w:t>
-      </w:r>
-    </w:p>
-    <w:p>
-      <w:pPr/>
-      <w:r>
-        <w:t>9. Learnings and Reflection</w:t>
-      </w:r>
-    </w:p>
-    <w:p>
-      <w:pPr/>
-      <w:r>
-        <w:t>10. Use of AI Tools Disclosure</w:t>
-      </w:r>
-    </w:p>
-    <w:p>
-      <w:pPr/>
-      <w:r>
-        <w:t>Appendix A. Interface Evidence</w:t>
-      </w:r>
-    </w:p>
+    <w:tbl>
+      <w:tblPr>
+        <w:tblStyle w:val="TableGrid"/>
+        <w:tblW w:type="auto" w:w="0"/>
+        <w:jc w:val="center"/>
+        <w:tblLayout w:type="fixed"/>
+        <w:tblLook w:firstColumn="1" w:firstRow="1" w:lastColumn="0" w:lastRow="0" w:noHBand="0" w:noVBand="1" w:val="04A0"/>
+      </w:tblPr>
+      <w:tblGrid>
+        <w:gridCol w:w="3120"/>
+        <w:gridCol w:w="3120"/>
+        <w:gridCol w:w="3120"/>
+      </w:tblGrid>
+      <w:tr>
+        <w:tc>
+          <w:tcPr>
+            <w:tcW w:type="dxa" w:w="1080"/>
+            <w:vAlign w:val="center"/>
+            <w:shd w:fill="1D6846"/>
+          </w:tcPr>
+          <w:p>
+            <w:pPr>
+              <w:jc w:val="center"/>
+            </w:pPr>
+            <w:r>
+              <w:rPr>
+                <w:b/>
+                <w:color w:val="FFFFFF"/>
+                <w:sz w:val="20"/>
+              </w:rPr>
+              <w:t>No.</w:t>
+            </w:r>
+          </w:p>
+        </w:tc>
+        <w:tc>
+          <w:tcPr>
+            <w:tcW w:type="dxa" w:w="7272"/>
+            <w:vAlign w:val="center"/>
+            <w:shd w:fill="1D6846"/>
+          </w:tcPr>
+          <w:p>
+            <w:pPr>
+              <w:jc w:val="left"/>
+            </w:pPr>
+            <w:r>
+              <w:rPr>
+                <w:b/>
+                <w:color w:val="FFFFFF"/>
+                <w:sz w:val="20"/>
+              </w:rPr>
+              <w:t>Section</w:t>
+            </w:r>
+          </w:p>
+        </w:tc>
+        <w:tc>
+          <w:tcPr>
+            <w:tcW w:type="dxa" w:w="936"/>
+            <w:vAlign w:val="center"/>
+            <w:shd w:fill="1D6846"/>
+          </w:tcPr>
+          <w:p>
+            <w:pPr>
+              <w:jc w:val="center"/>
+            </w:pPr>
+            <w:r>
+              <w:rPr>
+                <w:b/>
+                <w:color w:val="FFFFFF"/>
+                <w:sz w:val="20"/>
+              </w:rPr>
+              <w:t>Page</w:t>
+            </w:r>
+          </w:p>
+        </w:tc>
+      </w:tr>
+      <w:tr>
+        <w:tc>
+          <w:tcPr>
+            <w:tcW w:type="dxa" w:w="1080"/>
+            <w:vAlign w:val="center"/>
+            <w:shd w:fill="F3F8F4"/>
+          </w:tcPr>
+          <w:p>
+            <w:pPr>
+              <w:spacing w:before="80" w:after="80"/>
+              <w:jc w:val="center"/>
+            </w:pPr>
+            <w:r>
+              <w:rPr>
+                <w:rFonts w:ascii="Aptos" w:hAnsi="Aptos"/>
+                <w:sz w:val="20"/>
+              </w:rPr>
+              <w:t>1.</w:t>
+            </w:r>
+          </w:p>
+        </w:tc>
+        <w:tc>
+          <w:tcPr>
+            <w:tcW w:type="dxa" w:w="7272"/>
+            <w:vAlign w:val="center"/>
+            <w:shd w:fill="F3F8F4"/>
+          </w:tcPr>
+          <w:p>
+            <w:pPr>
+              <w:spacing w:before="80" w:after="80"/>
+              <w:jc w:val="left"/>
+            </w:pPr>
+            <w:r>
+              <w:rPr>
+                <w:rFonts w:ascii="Aptos" w:hAnsi="Aptos"/>
+                <w:sz w:val="20"/>
+              </w:rPr>
+              <w:t>Project Overview</w:t>
+            </w:r>
+          </w:p>
+        </w:tc>
+        <w:tc>
+          <w:tcPr>
+            <w:tcW w:type="dxa" w:w="936"/>
+            <w:vAlign w:val="center"/>
+            <w:shd w:fill="F3F8F4"/>
+          </w:tcPr>
+          <w:p>
+            <w:r>
+              <w:t>3</w:t>
+            </w:r>
+          </w:p>
+        </w:tc>
+      </w:tr>
+      <w:tr>
+        <w:tc>
+          <w:tcPr>
+            <w:tcW w:type="dxa" w:w="1080"/>
+            <w:vAlign w:val="center"/>
+          </w:tcPr>
+          <w:p>
+            <w:pPr>
+              <w:spacing w:before="80" w:after="80"/>
+              <w:jc w:val="center"/>
+            </w:pPr>
+            <w:r>
+              <w:rPr>
+                <w:rFonts w:ascii="Aptos" w:hAnsi="Aptos"/>
+                <w:sz w:val="20"/>
+              </w:rPr>
+              <w:t>2.</w:t>
+            </w:r>
+          </w:p>
+        </w:tc>
+        <w:tc>
+          <w:tcPr>
+            <w:tcW w:type="dxa" w:w="7272"/>
+            <w:vAlign w:val="center"/>
+          </w:tcPr>
+          <w:p>
+            <w:pPr>
+              <w:spacing w:before="80" w:after="80"/>
+              <w:jc w:val="left"/>
+            </w:pPr>
+            <w:r>
+              <w:rPr>
+                <w:rFonts w:ascii="Aptos" w:hAnsi="Aptos"/>
+                <w:sz w:val="20"/>
+              </w:rPr>
+              <w:t>Input Data and Model Preparation</w:t>
+            </w:r>
+          </w:p>
+        </w:tc>
+        <w:tc>
+          <w:tcPr>
+            <w:tcW w:type="dxa" w:w="936"/>
+            <w:vAlign w:val="center"/>
+          </w:tcPr>
+          <w:p>
+            <w:r>
+              <w:t>3</w:t>
+            </w:r>
+          </w:p>
+        </w:tc>
+      </w:tr>
+      <w:tr>
+        <w:tc>
+          <w:tcPr>
+            <w:tcW w:type="dxa" w:w="1080"/>
+            <w:vAlign w:val="center"/>
+            <w:shd w:fill="F3F8F4"/>
+          </w:tcPr>
+          <w:p>
+            <w:pPr>
+              <w:spacing w:before="80" w:after="80"/>
+              <w:jc w:val="center"/>
+            </w:pPr>
+            <w:r>
+              <w:rPr>
+                <w:rFonts w:ascii="Aptos" w:hAnsi="Aptos"/>
+                <w:sz w:val="20"/>
+              </w:rPr>
+              <w:t>3.</w:t>
+            </w:r>
+          </w:p>
+        </w:tc>
+        <w:tc>
+          <w:tcPr>
+            <w:tcW w:type="dxa" w:w="7272"/>
+            <w:vAlign w:val="center"/>
+            <w:shd w:fill="F3F8F4"/>
+          </w:tcPr>
+          <w:p>
+            <w:pPr>
+              <w:spacing w:before="80" w:after="80"/>
+              <w:jc w:val="left"/>
+            </w:pPr>
+            <w:r>
+              <w:rPr>
+                <w:rFonts w:ascii="Aptos" w:hAnsi="Aptos"/>
+                <w:sz w:val="20"/>
+              </w:rPr>
+              <w:t>System Architecture</w:t>
+            </w:r>
+          </w:p>
+        </w:tc>
+        <w:tc>
+          <w:tcPr>
+            <w:tcW w:type="dxa" w:w="936"/>
+            <w:vAlign w:val="center"/>
+            <w:shd w:fill="F3F8F4"/>
+          </w:tcPr>
+          <w:p>
+            <w:r>
+              <w:t>4</w:t>
+            </w:r>
+          </w:p>
+        </w:tc>
+      </w:tr>
+      <w:tr>
+        <w:tc>
+          <w:tcPr>
+            <w:tcW w:type="dxa" w:w="1080"/>
+            <w:vAlign w:val="center"/>
+          </w:tcPr>
+          <w:p>
+            <w:pPr>
+              <w:spacing w:before="80" w:after="80"/>
+              <w:jc w:val="center"/>
+            </w:pPr>
+            <w:r>
+              <w:rPr>
+                <w:rFonts w:ascii="Aptos" w:hAnsi="Aptos"/>
+                <w:sz w:val="20"/>
+              </w:rPr>
+              <w:t>4.</w:t>
+            </w:r>
+          </w:p>
+        </w:tc>
+        <w:tc>
+          <w:tcPr>
+            <w:tcW w:type="dxa" w:w="7272"/>
+            <w:vAlign w:val="center"/>
+          </w:tcPr>
+          <w:p>
+            <w:pPr>
+              <w:spacing w:before="80" w:after="80"/>
+              <w:jc w:val="left"/>
+            </w:pPr>
+            <w:r>
+              <w:rPr>
+                <w:rFonts w:ascii="Aptos" w:hAnsi="Aptos"/>
+                <w:sz w:val="20"/>
+              </w:rPr>
+              <w:t>Implementation Details</w:t>
+            </w:r>
+          </w:p>
+        </w:tc>
+        <w:tc>
+          <w:tcPr>
+            <w:tcW w:type="dxa" w:w="936"/>
+            <w:vAlign w:val="center"/>
+          </w:tcPr>
+          <w:p>
+            <w:r>
+              <w:t>5</w:t>
+            </w:r>
+          </w:p>
+        </w:tc>
+      </w:tr>
+      <w:tr>
+        <w:tc>
+          <w:tcPr>
+            <w:tcW w:type="dxa" w:w="1080"/>
+            <w:vAlign w:val="center"/>
+            <w:shd w:fill="F3F8F4"/>
+          </w:tcPr>
+          <w:p>
+            <w:pPr>
+              <w:spacing w:before="80" w:after="80"/>
+              <w:jc w:val="center"/>
+            </w:pPr>
+            <w:r>
+              <w:rPr>
+                <w:rFonts w:ascii="Aptos" w:hAnsi="Aptos"/>
+                <w:sz w:val="20"/>
+              </w:rPr>
+              <w:t>5.</w:t>
+            </w:r>
+          </w:p>
+        </w:tc>
+        <w:tc>
+          <w:tcPr>
+            <w:tcW w:type="dxa" w:w="7272"/>
+            <w:vAlign w:val="center"/>
+            <w:shd w:fill="F3F8F4"/>
+          </w:tcPr>
+          <w:p>
+            <w:pPr>
+              <w:spacing w:before="80" w:after="80"/>
+              <w:jc w:val="left"/>
+            </w:pPr>
+            <w:r>
+              <w:rPr>
+                <w:rFonts w:ascii="Aptos" w:hAnsi="Aptos"/>
+                <w:sz w:val="20"/>
+              </w:rPr>
+              <w:t>Test Sheet: Sample Scenarios and Outputs</w:t>
+            </w:r>
+          </w:p>
+        </w:tc>
+        <w:tc>
+          <w:tcPr>
+            <w:tcW w:type="dxa" w:w="936"/>
+            <w:vAlign w:val="center"/>
+            <w:shd w:fill="F3F8F4"/>
+          </w:tcPr>
+          <w:p>
+            <w:r>
+              <w:t>6</w:t>
+            </w:r>
+          </w:p>
+        </w:tc>
+      </w:tr>
+      <w:tr>
+        <w:tc>
+          <w:tcPr>
+            <w:tcW w:type="dxa" w:w="1080"/>
+            <w:vAlign w:val="center"/>
+          </w:tcPr>
+          <w:p>
+            <w:pPr>
+              <w:spacing w:before="80" w:after="80"/>
+              <w:jc w:val="center"/>
+            </w:pPr>
+            <w:r>
+              <w:rPr>
+                <w:rFonts w:ascii="Aptos" w:hAnsi="Aptos"/>
+                <w:sz w:val="20"/>
+              </w:rPr>
+              <w:t>6.</w:t>
+            </w:r>
+          </w:p>
+        </w:tc>
+        <w:tc>
+          <w:tcPr>
+            <w:tcW w:type="dxa" w:w="7272"/>
+            <w:vAlign w:val="center"/>
+          </w:tcPr>
+          <w:p>
+            <w:pPr>
+              <w:spacing w:before="80" w:after="80"/>
+              <w:jc w:val="left"/>
+            </w:pPr>
+            <w:r>
+              <w:rPr>
+                <w:rFonts w:ascii="Aptos" w:hAnsi="Aptos"/>
+                <w:sz w:val="20"/>
+              </w:rPr>
+              <w:t>Evaluation</w:t>
+            </w:r>
+          </w:p>
+        </w:tc>
+        <w:tc>
+          <w:tcPr>
+            <w:tcW w:type="dxa" w:w="936"/>
+            <w:vAlign w:val="center"/>
+          </w:tcPr>
+          <w:p>
+            <w:r>
+              <w:t>6</w:t>
+            </w:r>
+          </w:p>
+        </w:tc>
+      </w:tr>
+      <w:tr>
+        <w:tc>
+          <w:tcPr>
+            <w:tcW w:type="dxa" w:w="1080"/>
+            <w:vAlign w:val="center"/>
+            <w:shd w:fill="F3F8F4"/>
+          </w:tcPr>
+          <w:p>
+            <w:pPr>
+              <w:spacing w:before="80" w:after="80"/>
+              <w:jc w:val="center"/>
+            </w:pPr>
+            <w:r>
+              <w:rPr>
+                <w:rFonts w:ascii="Aptos" w:hAnsi="Aptos"/>
+                <w:sz w:val="20"/>
+              </w:rPr>
+              <w:t>7.</w:t>
+            </w:r>
+          </w:p>
+        </w:tc>
+        <w:tc>
+          <w:tcPr>
+            <w:tcW w:type="dxa" w:w="7272"/>
+            <w:vAlign w:val="center"/>
+            <w:shd w:fill="F3F8F4"/>
+          </w:tcPr>
+          <w:p>
+            <w:pPr>
+              <w:spacing w:before="80" w:after="80"/>
+              <w:jc w:val="left"/>
+            </w:pPr>
+            <w:r>
+              <w:rPr>
+                <w:rFonts w:ascii="Aptos" w:hAnsi="Aptos"/>
+                <w:sz w:val="20"/>
+              </w:rPr>
+              <w:t>Failure Case Analysis</w:t>
+            </w:r>
+          </w:p>
+        </w:tc>
+        <w:tc>
+          <w:tcPr>
+            <w:tcW w:type="dxa" w:w="936"/>
+            <w:vAlign w:val="center"/>
+            <w:shd w:fill="F3F8F4"/>
+          </w:tcPr>
+          <w:p>
+            <w:r>
+              <w:t>6</w:t>
+            </w:r>
+          </w:p>
+        </w:tc>
+      </w:tr>
+      <w:tr>
+        <w:tc>
+          <w:tcPr>
+            <w:tcW w:type="dxa" w:w="1080"/>
+            <w:vAlign w:val="center"/>
+          </w:tcPr>
+          <w:p>
+            <w:pPr>
+              <w:spacing w:before="80" w:after="80"/>
+              <w:jc w:val="center"/>
+            </w:pPr>
+            <w:r>
+              <w:rPr>
+                <w:rFonts w:ascii="Aptos" w:hAnsi="Aptos"/>
+                <w:sz w:val="20"/>
+              </w:rPr>
+              <w:t>8.</w:t>
+            </w:r>
+          </w:p>
+        </w:tc>
+        <w:tc>
+          <w:tcPr>
+            <w:tcW w:type="dxa" w:w="7272"/>
+            <w:vAlign w:val="center"/>
+          </w:tcPr>
+          <w:p>
+            <w:pPr>
+              <w:spacing w:before="80" w:after="80"/>
+              <w:jc w:val="left"/>
+            </w:pPr>
+            <w:r>
+              <w:rPr>
+                <w:rFonts w:ascii="Aptos" w:hAnsi="Aptos"/>
+                <w:sz w:val="20"/>
+              </w:rPr>
+              <w:t>Limitations and Future Scope</w:t>
+            </w:r>
+          </w:p>
+        </w:tc>
+        <w:tc>
+          <w:tcPr>
+            <w:tcW w:type="dxa" w:w="936"/>
+            <w:vAlign w:val="center"/>
+          </w:tcPr>
+          <w:p>
+            <w:r>
+              <w:t>7</w:t>
+            </w:r>
+          </w:p>
+        </w:tc>
+      </w:tr>
+      <w:tr>
+        <w:tc>
+          <w:tcPr>
+            <w:tcW w:type="dxa" w:w="1080"/>
+            <w:vAlign w:val="center"/>
+            <w:shd w:fill="F3F8F4"/>
+          </w:tcPr>
+          <w:p>
+            <w:pPr>
+              <w:spacing w:before="80" w:after="80"/>
+              <w:jc w:val="center"/>
+            </w:pPr>
+            <w:r>
+              <w:rPr>
+                <w:rFonts w:ascii="Aptos" w:hAnsi="Aptos"/>
+                <w:sz w:val="20"/>
+              </w:rPr>
+              <w:t>9.</w:t>
+            </w:r>
+          </w:p>
+        </w:tc>
+        <w:tc>
+          <w:tcPr>
+            <w:tcW w:type="dxa" w:w="7272"/>
+            <w:vAlign w:val="center"/>
+            <w:shd w:fill="F3F8F4"/>
+          </w:tcPr>
+          <w:p>
+            <w:pPr>
+              <w:spacing w:before="80" w:after="80"/>
+              <w:jc w:val="left"/>
+            </w:pPr>
+            <w:r>
+              <w:rPr>
+                <w:rFonts w:ascii="Aptos" w:hAnsi="Aptos"/>
+                <w:sz w:val="20"/>
+              </w:rPr>
+              <w:t>Learnings and Reflection</w:t>
+            </w:r>
+          </w:p>
+        </w:tc>
+        <w:tc>
+          <w:tcPr>
+            <w:tcW w:type="dxa" w:w="936"/>
+            <w:vAlign w:val="center"/>
+            <w:shd w:fill="F3F8F4"/>
+          </w:tcPr>
+          <w:p>
+            <w:r>
+              <w:t>7</w:t>
+            </w:r>
+          </w:p>
+        </w:tc>
+      </w:tr>
+      <w:tr>
+        <w:tc>
+          <w:tcPr>
+            <w:tcW w:type="dxa" w:w="1080"/>
+            <w:vAlign w:val="center"/>
+          </w:tcPr>
+          <w:p>
+            <w:pPr>
+              <w:spacing w:before="80" w:after="80"/>
+              <w:jc w:val="center"/>
+            </w:pPr>
+            <w:r>
+              <w:rPr>
+                <w:rFonts w:ascii="Aptos" w:hAnsi="Aptos"/>
+                <w:sz w:val="20"/>
+              </w:rPr>
+              <w:t>10.</w:t>
+            </w:r>
+          </w:p>
+        </w:tc>
+        <w:tc>
+          <w:tcPr>
+            <w:tcW w:type="dxa" w:w="7272"/>
+            <w:vAlign w:val="center"/>
+          </w:tcPr>
+          <w:p>
+            <w:pPr>
+              <w:spacing w:before="80" w:after="80"/>
+              <w:jc w:val="left"/>
+            </w:pPr>
+            <w:r>
+              <w:rPr>
+                <w:rFonts w:ascii="Aptos" w:hAnsi="Aptos"/>
+                <w:sz w:val="20"/>
+              </w:rPr>
+              <w:t>Use of AI Tools Disclosure</w:t>
+            </w:r>
+          </w:p>
+        </w:tc>
+        <w:tc>
+          <w:tcPr>
+            <w:tcW w:type="dxa" w:w="936"/>
+            <w:vAlign w:val="center"/>
+          </w:tcPr>
+          <w:p>
+            <w:r>
+              <w:t>7</w:t>
+            </w:r>
+          </w:p>
+        </w:tc>
+      </w:tr>
+      <w:tr>
+        <w:tc>
+          <w:tcPr>
+            <w:tcW w:type="dxa" w:w="1080"/>
+            <w:vAlign w:val="center"/>
+            <w:shd w:fill="F3F8F4"/>
+          </w:tcPr>
+          <w:p>
+            <w:pPr>
+              <w:spacing w:before="80" w:after="80"/>
+              <w:jc w:val="center"/>
+            </w:pPr>
+            <w:r>
+              <w:rPr>
+                <w:rFonts w:ascii="Aptos" w:hAnsi="Aptos"/>
+                <w:sz w:val="20"/>
+              </w:rPr>
+              <w:t>A.</w:t>
+            </w:r>
+          </w:p>
+        </w:tc>
+        <w:tc>
+          <w:tcPr>
+            <w:tcW w:type="dxa" w:w="7272"/>
+            <w:vAlign w:val="center"/>
+            <w:shd w:fill="F3F8F4"/>
+          </w:tcPr>
+          <w:p>
+            <w:pPr>
+              <w:spacing w:before="80" w:after="80"/>
+              <w:jc w:val="left"/>
+            </w:pPr>
+            <w:r>
+              <w:rPr>
+                <w:rFonts w:ascii="Aptos" w:hAnsi="Aptos"/>
+                <w:sz w:val="20"/>
+              </w:rPr>
+              <w:t>Interface Evidence</w:t>
+            </w:r>
+          </w:p>
+        </w:tc>
+        <w:tc>
+          <w:tcPr>
+            <w:tcW w:type="dxa" w:w="936"/>
+            <w:vAlign w:val="center"/>
+            <w:shd w:fill="F3F8F4"/>
+          </w:tcPr>
+          <w:p>
+            <w:r>
+              <w:t>8</w:t>
+            </w:r>
+          </w:p>
+        </w:tc>
+      </w:tr>
+    </w:tbl>
     <w:p>
       <w:pPr>
         <w:pStyle w:val="Heading2"/>
@@ -1059,15 +1634,41 @@
       </w:pPr>
       <w:r>
         <w:rPr>
+          <w:rFonts w:ascii="Aptos" w:hAnsi="Aptos" w:eastAsia="Times New Roman" w:cs="Times New Roman"/>
+          <w:b/>
+          <w:color w:val="1C5339"/>
+          <w:sz w:val="28"/>
+        </w:rPr>
+        <w:t>1</w:t>
+      </w:r>
+      <w:r>
+        <w:rPr>
+          <w:rFonts w:ascii="Aptos" w:hAnsi="Aptos" w:eastAsia="Times New Roman" w:cs="Times New Roman"/>
+          <w:b/>
+          <w:color w:val="1C5339"/>
+          <w:sz w:val="28"/>
+        </w:rPr>
+        <w:t>. Project Overview</w:t>
+      </w:r>
+    </w:p>
+    <w:p>
+      <w:pPr>
+        <w:rPr>
           <w:rFonts w:ascii="Times New Roman" w:hAnsi="Times New Roman" w:eastAsia="Times New Roman" w:cs="Times New Roman"/>
         </w:rPr>
-        <w:t>1</w:t>
-      </w:r>
-      <w:r>
+      </w:pPr>
+      <w:r>
+        <w:t>Project title: WasteVision AI</w:t>
+      </w:r>
+    </w:p>
+    <w:p>
+      <w:pPr>
         <w:rPr>
           <w:rFonts w:ascii="Times New Roman" w:hAnsi="Times New Roman" w:eastAsia="Times New Roman" w:cs="Times New Roman"/>
         </w:rPr>
-        <w:t>. Project Overview</w:t>
+      </w:pPr>
+      <w:r>
+        <w:t>Domain: Environmental sustainability and community waste response</w:t>
       </w:r>
     </w:p>
     <w:p>
@@ -1077,7 +1678,7 @@
         </w:rPr>
       </w:pPr>
       <w:r>
-        <w:t>Project title: WasteVision AI</w:t>
+        <w:t>Target users: Residents, campus communities, and cleanup coordinators</w:t>
       </w:r>
     </w:p>
     <w:p>
@@ -1087,7 +1688,7 @@
         </w:rPr>
       </w:pPr>
       <w:r>
-        <w:t>Domain: Environmental sustainability and community waste response</w:t>
+        <w:t>Problem statement: People may be unsure how to sort individual items, while mixed waste and overflowing public bins can be difficult to report and prioritize. A single workflow can connect visual inspection, plain-language sorting guidance, and a trackable cleanup queue.</w:t>
       </w:r>
     </w:p>
     <w:p>
@@ -1097,37 +1698,23 @@
         </w:rPr>
       </w:pPr>
       <w:r>
-        <w:t>Target users: Residents, campus communities, and cleanup coordinators</w:t>
-      </w:r>
-    </w:p>
-    <w:p>
-      <w:pPr>
+        <w:t>Value of the solution: The app combines photo-based waste scanning, free-text disposal lookup, hotspot reporting, a transparent triage estimate, and an impact dashboard. The prototype helps organize next steps; it does not establish official safety or environmental findings.</w:t>
+      </w:r>
+    </w:p>
+    <w:p>
+      <w:pPr>
+        <w:pStyle w:val="Heading2"/>
         <w:rPr>
           <w:rFonts w:ascii="Times New Roman" w:hAnsi="Times New Roman" w:eastAsia="Times New Roman" w:cs="Times New Roman"/>
         </w:rPr>
       </w:pPr>
       <w:r>
-        <w:t>Problem statement: People may be unsure how to sort individual items, while mixed waste and overflowing public bins can be difficult to report and prioritize. A single workflow can connect visual inspection, plain-language sorting guidance, and a trackable cleanup queue.</w:t>
-      </w:r>
-    </w:p>
-    <w:p>
-      <w:pPr>
-        <w:rPr>
-          <w:rFonts w:ascii="Times New Roman" w:hAnsi="Times New Roman" w:eastAsia="Times New Roman" w:cs="Times New Roman"/>
-        </w:rPr>
-      </w:pPr>
-      <w:r>
-        <w:t>Value of the solution: The app combines photo-based waste scanning, free-text disposal lookup, hotspot reporting, a transparent triage estimate, and an impact dashboard. The prototype helps organize next steps; it does not establish official safety or environmental findings.</w:t>
-      </w:r>
-    </w:p>
-    <w:p>
-      <w:pPr>
-        <w:pStyle w:val="Heading2"/>
-        <w:rPr>
-          <w:rFonts w:ascii="Times New Roman" w:hAnsi="Times New Roman" w:eastAsia="Times New Roman" w:cs="Times New Roman"/>
-        </w:rPr>
-      </w:pPr>
-      <w:r>
+        <w:rPr>
+          <w:rFonts w:ascii="Aptos" w:hAnsi="Aptos"/>
+          <w:b/>
+          <w:color w:val="1C5339"/>
+          <w:sz w:val="28"/>
+        </w:rPr>
         <w:t>2. Input Data and Model Preparation</w:t>
       </w:r>
     </w:p>
@@ -1457,13 +2044,19 @@
       </w:pPr>
       <w:r>
         <w:rPr>
-          <w:rFonts w:ascii="Times New Roman" w:hAnsi="Times New Roman" w:eastAsia="Times New Roman" w:cs="Times New Roman"/>
+          <w:rFonts w:ascii="Aptos" w:hAnsi="Aptos" w:eastAsia="Times New Roman" w:cs="Times New Roman"/>
+          <w:b/>
+          <w:color w:val="1C5339"/>
+          <w:sz w:val="28"/>
         </w:rPr>
         <w:t>3</w:t>
       </w:r>
       <w:r>
         <w:rPr>
-          <w:rFonts w:ascii="Times New Roman" w:hAnsi="Times New Roman" w:eastAsia="Times New Roman" w:cs="Times New Roman"/>
+          <w:rFonts w:ascii="Aptos" w:hAnsi="Aptos" w:eastAsia="Times New Roman" w:cs="Times New Roman"/>
+          <w:b/>
+          <w:color w:val="1C5339"/>
+          <w:sz w:val="28"/>
         </w:rPr>
         <w:t>. System Architecture</w:t>
       </w:r>
@@ -1498,6 +2091,12 @@
         </w:rPr>
       </w:pPr>
       <w:r>
+        <w:rPr>
+          <w:rFonts w:ascii="Aptos" w:hAnsi="Aptos"/>
+          <w:b/>
+          <w:color w:val="1C5339"/>
+          <w:sz w:val="28"/>
+        </w:rPr>
         <w:t>3.1 Pipeline Stages</w:t>
       </w:r>
     </w:p>
@@ -1898,6 +2497,12 @@
         </w:rPr>
       </w:pPr>
       <w:r>
+        <w:rPr>
+          <w:rFonts w:ascii="Aptos" w:hAnsi="Aptos"/>
+          <w:b/>
+          <w:color w:val="1C5339"/>
+          <w:sz w:val="28"/>
+        </w:rPr>
         <w:t>3.2 Sorting Guidance Rules</w:t>
       </w:r>
     </w:p>
@@ -1931,6 +2536,12 @@
         </w:rPr>
       </w:pPr>
       <w:r>
+        <w:rPr>
+          <w:rFonts w:ascii="Aptos" w:hAnsi="Aptos"/>
+          <w:b/>
+          <w:color w:val="1C5339"/>
+          <w:sz w:val="28"/>
+        </w:rPr>
         <w:t>3.3 Handling Unknown Items</w:t>
       </w:r>
     </w:p>
@@ -1953,33 +2564,45 @@
       </w:pPr>
       <w:r>
         <w:rPr>
+          <w:rFonts w:ascii="Aptos" w:hAnsi="Aptos" w:eastAsia="Times New Roman" w:cs="Times New Roman"/>
+          <w:b/>
+          <w:color w:val="1C5339"/>
+          <w:sz w:val="28"/>
+        </w:rPr>
+        <w:t>4</w:t>
+      </w:r>
+      <w:r>
+        <w:rPr>
+          <w:rFonts w:ascii="Aptos" w:hAnsi="Aptos" w:eastAsia="Times New Roman" w:cs="Times New Roman"/>
+          <w:b/>
+          <w:color w:val="1C5339"/>
+          <w:sz w:val="28"/>
+        </w:rPr>
+        <w:t>. Implementation Details</w:t>
+      </w:r>
+    </w:p>
+    <w:p>
+      <w:pPr>
+        <w:pStyle w:val="Heading3"/>
+        <w:rPr>
           <w:rFonts w:ascii="Times New Roman" w:hAnsi="Times New Roman" w:eastAsia="Times New Roman" w:cs="Times New Roman"/>
         </w:rPr>
+      </w:pPr>
+      <w:r>
+        <w:rPr>
+          <w:rFonts w:ascii="Aptos" w:hAnsi="Aptos" w:eastAsia="Times New Roman" w:cs="Times New Roman"/>
+          <w:b/>
+          <w:color w:val="1C5339"/>
+          <w:sz w:val="28"/>
+        </w:rPr>
         <w:t>4</w:t>
       </w:r>
       <w:r>
         <w:rPr>
-          <w:rFonts w:ascii="Times New Roman" w:hAnsi="Times New Roman" w:eastAsia="Times New Roman" w:cs="Times New Roman"/>
-        </w:rPr>
-        <w:t>. Implementation Details</w:t>
-      </w:r>
-    </w:p>
-    <w:p>
-      <w:pPr>
-        <w:pStyle w:val="Heading3"/>
-        <w:rPr>
-          <w:rFonts w:ascii="Times New Roman" w:hAnsi="Times New Roman" w:eastAsia="Times New Roman" w:cs="Times New Roman"/>
-        </w:rPr>
-      </w:pPr>
-      <w:r>
-        <w:rPr>
-          <w:rFonts w:ascii="Times New Roman" w:hAnsi="Times New Roman" w:eastAsia="Times New Roman" w:cs="Times New Roman"/>
-        </w:rPr>
-        <w:t>4</w:t>
-      </w:r>
-      <w:r>
-        <w:rPr>
-          <w:rFonts w:ascii="Times New Roman" w:hAnsi="Times New Roman" w:eastAsia="Times New Roman" w:cs="Times New Roman"/>
+          <w:rFonts w:ascii="Aptos" w:hAnsi="Aptos" w:eastAsia="Times New Roman" w:cs="Times New Roman"/>
+          <w:b/>
+          <w:color w:val="1C5339"/>
+          <w:sz w:val="28"/>
         </w:rPr>
         <w:t>.1 Tools and Libraries</w:t>
       </w:r>
@@ -2228,13 +2851,19 @@
       </w:pPr>
       <w:r>
         <w:rPr>
-          <w:rFonts w:ascii="Times New Roman" w:hAnsi="Times New Roman" w:eastAsia="Times New Roman" w:cs="Times New Roman"/>
+          <w:rFonts w:ascii="Aptos" w:hAnsi="Aptos" w:eastAsia="Times New Roman" w:cs="Times New Roman"/>
+          <w:b/>
+          <w:color w:val="1C5339"/>
+          <w:sz w:val="28"/>
         </w:rPr>
         <w:t>4</w:t>
       </w:r>
       <w:r>
         <w:rPr>
-          <w:rFonts w:ascii="Times New Roman" w:hAnsi="Times New Roman" w:eastAsia="Times New Roman" w:cs="Times New Roman"/>
+          <w:rFonts w:ascii="Aptos" w:hAnsi="Aptos" w:eastAsia="Times New Roman" w:cs="Times New Roman"/>
+          <w:b/>
+          <w:color w:val="1C5339"/>
+          <w:sz w:val="28"/>
         </w:rPr>
         <w:t>.2 What We Built vs. What We Borrowed</w:t>
       </w:r>
@@ -2501,6 +3130,12 @@
         </w:rPr>
       </w:pPr>
       <w:r>
+        <w:rPr>
+          <w:rFonts w:ascii="Aptos" w:hAnsi="Aptos"/>
+          <w:b/>
+          <w:color w:val="1C5339"/>
+          <w:sz w:val="28"/>
+        </w:rPr>
         <w:t>4.3 Report Data and Priority Logic</w:t>
       </w:r>
     </w:p>
@@ -2557,6 +3192,12 @@
         </w:rPr>
       </w:pPr>
       <w:r>
+        <w:rPr>
+          <w:rFonts w:ascii="Aptos" w:hAnsi="Aptos"/>
+          <w:b/>
+          <w:color w:val="1C5339"/>
+          <w:sz w:val="28"/>
+        </w:rPr>
         <w:t>5. Test Sheet: Sample Scenarios and Outputs</w:t>
       </w:r>
     </w:p>
@@ -3082,13 +3723,19 @@
       </w:pPr>
       <w:r>
         <w:rPr>
-          <w:rFonts w:ascii="Times New Roman" w:hAnsi="Times New Roman" w:eastAsia="Times New Roman" w:cs="Times New Roman"/>
+          <w:rFonts w:ascii="Aptos" w:hAnsi="Aptos" w:eastAsia="Times New Roman" w:cs="Times New Roman"/>
+          <w:b/>
+          <w:color w:val="1C5339"/>
+          <w:sz w:val="28"/>
         </w:rPr>
         <w:t>6</w:t>
       </w:r>
       <w:r>
         <w:rPr>
-          <w:rFonts w:ascii="Times New Roman" w:hAnsi="Times New Roman" w:eastAsia="Times New Roman" w:cs="Times New Roman"/>
+          <w:rFonts w:ascii="Aptos" w:hAnsi="Aptos" w:eastAsia="Times New Roman" w:cs="Times New Roman"/>
+          <w:b/>
+          <w:color w:val="1C5339"/>
+          <w:sz w:val="28"/>
         </w:rPr>
         <w:t>. Evaluation</w:t>
       </w:r>
@@ -3385,13 +4032,19 @@
       </w:pPr>
       <w:r>
         <w:rPr>
-          <w:rFonts w:ascii="Times New Roman" w:hAnsi="Times New Roman" w:eastAsia="Times New Roman" w:cs="Times New Roman"/>
+          <w:rFonts w:ascii="Aptos" w:hAnsi="Aptos" w:eastAsia="Times New Roman" w:cs="Times New Roman"/>
+          <w:b/>
+          <w:color w:val="1C5339"/>
+          <w:sz w:val="28"/>
         </w:rPr>
         <w:t>7</w:t>
       </w:r>
       <w:r>
         <w:rPr>
-          <w:rFonts w:ascii="Times New Roman" w:hAnsi="Times New Roman" w:eastAsia="Times New Roman" w:cs="Times New Roman"/>
+          <w:rFonts w:ascii="Aptos" w:hAnsi="Aptos" w:eastAsia="Times New Roman" w:cs="Times New Roman"/>
+          <w:b/>
+          <w:color w:val="1C5339"/>
+          <w:sz w:val="28"/>
         </w:rPr>
         <w:t>. Failure Case Analysis</w:t>
       </w:r>
@@ -3718,25 +4371,67 @@
       </w:pPr>
       <w:r>
         <w:rPr>
+          <w:rFonts w:ascii="Aptos" w:hAnsi="Aptos" w:eastAsia="Times New Roman" w:cs="Times New Roman"/>
+          <w:b/>
+          <w:color w:val="1C5339"/>
+          <w:sz w:val="28"/>
+        </w:rPr>
+        <w:t>8</w:t>
+      </w:r>
+      <w:r>
+        <w:rPr>
+          <w:rFonts w:ascii="Aptos" w:hAnsi="Aptos" w:eastAsia="Times New Roman" w:cs="Times New Roman"/>
+          <w:b/>
+          <w:color w:val="1C5339"/>
+          <w:sz w:val="28"/>
+        </w:rPr>
+        <w:t>. Limitations and Future Scope</w:t>
+      </w:r>
+    </w:p>
+    <w:p>
+      <w:pPr>
+        <w:rPr>
           <w:rFonts w:ascii="Times New Roman" w:hAnsi="Times New Roman" w:eastAsia="Times New Roman" w:cs="Times New Roman"/>
         </w:rPr>
-        <w:t>8</w:t>
-      </w:r>
-      <w:r>
+      </w:pPr>
+      <w:r>
+        <w:t>Limitations: The open-vocabulary detector is not trained or validated specifically for waste. Small, hidden, overlapping, or unfamiliar objects may be missed or mislabeled; the screenshot shows only one detection in a cluttered bin. Sorting rules are broad and vary by municipality. The SQLite prototype has no authentication, moderation, or multi-user synchronization. Seeded reports and demo detections are illustrative, not verified observations. Priority is a triage estimate, not an official hazard assessment.</w:t>
+      </w:r>
+    </w:p>
+    <w:p>
+      <w:pPr>
         <w:rPr>
           <w:rFonts w:ascii="Times New Roman" w:hAnsi="Times New Roman" w:eastAsia="Times New Roman" w:cs="Times New Roman"/>
         </w:rPr>
-        <w:t>. Limitations and Future Scope</w:t>
-      </w:r>
-    </w:p>
-    <w:p>
-      <w:pPr>
+      </w:pPr>
+      <w:r>
+        <w:t>Future improvements: Collect and label diverse local waste images, then validate and fine-tune a waste-specific detector. Measure per-class precision and recall against a held-out dataset, improve clutter and small-object detection, and add calibrated confidence warnings. Add municipal-specific sorting rules, multilingual lookup, report photo review, map-based location capture, and verified before-and-after cleanup tracking.</w:t>
+      </w:r>
+    </w:p>
+    <w:p>
+      <w:pPr>
+        <w:pStyle w:val="Heading2"/>
         <w:rPr>
           <w:rFonts w:ascii="Times New Roman" w:hAnsi="Times New Roman" w:eastAsia="Times New Roman" w:cs="Times New Roman"/>
         </w:rPr>
       </w:pPr>
       <w:r>
-        <w:t>Limitations: The open-vocabulary detector is not trained or validated specifically for waste. Small, hidden, overlapping, or unfamiliar objects may be missed or mislabeled; the screenshot shows only one detection in a cluttered bin. Sorting rules are broad and vary by municipality. The SQLite prototype has no authentication, moderation, or multi-user synchronization. Seeded reports and demo detections are illustrative, not verified observations. Priority is a triage estimate, not an official hazard assessment.</w:t>
+        <w:rPr>
+          <w:rFonts w:ascii="Aptos" w:hAnsi="Aptos" w:eastAsia="Times New Roman" w:cs="Times New Roman"/>
+          <w:b/>
+          <w:color w:val="1C5339"/>
+          <w:sz w:val="28"/>
+        </w:rPr>
+        <w:t>9</w:t>
+      </w:r>
+      <w:r>
+        <w:rPr>
+          <w:rFonts w:ascii="Aptos" w:hAnsi="Aptos" w:eastAsia="Times New Roman" w:cs="Times New Roman"/>
+          <w:b/>
+          <w:color w:val="1C5339"/>
+          <w:sz w:val="28"/>
+        </w:rPr>
+        <w:t>. Learnings and Reflection</w:t>
       </w:r>
     </w:p>
     <w:p>
@@ -3746,7 +4441,7 @@
         </w:rPr>
       </w:pPr>
       <w:r>
-        <w:t>Future improvements: Collect and label diverse local waste images, then validate and fine-tune a waste-specific detector. Measure per-class precision and recall against a held-out dataset, improve clutter and small-object detection, and add calibrated confidence warnings. Add municipal-specific sorting rules, multilingual lookup, report photo review, map-based location capture, and verified before-and-after cleanup tracking.</w:t>
+        <w:t>The project combines computer vision, rule-based guidance, persistence, and dashboard design in one prototype. The mixed-bin scan demonstrates the challenge of detecting small and overlapping objects and the need to evaluate outputs against labeled examples. The modular Streamlit structure keeps scanning, segregation, reporting, and analytics independently extensible. The work connects software implementation with practical community waste workflows.</w:t>
       </w:r>
     </w:p>
     <w:p>
@@ -3758,43 +4453,19 @@
       </w:pPr>
       <w:r>
         <w:rPr>
-          <w:rFonts w:ascii="Times New Roman" w:hAnsi="Times New Roman" w:eastAsia="Times New Roman" w:cs="Times New Roman"/>
-        </w:rPr>
-        <w:t>9</w:t>
-      </w:r>
-      <w:r>
-        <w:rPr>
-          <w:rFonts w:ascii="Times New Roman" w:hAnsi="Times New Roman" w:eastAsia="Times New Roman" w:cs="Times New Roman"/>
-        </w:rPr>
-        <w:t>. Learnings and Reflection</w:t>
-      </w:r>
-    </w:p>
-    <w:p>
-      <w:pPr>
-        <w:rPr>
-          <w:rFonts w:ascii="Times New Roman" w:hAnsi="Times New Roman" w:eastAsia="Times New Roman" w:cs="Times New Roman"/>
-        </w:rPr>
-      </w:pPr>
-      <w:r>
-        <w:t>The project combines computer vision, rule-based guidance, persistence, and dashboard design in one prototype. The mixed-bin scan demonstrates the challenge of detecting small and overlapping objects and the need to evaluate outputs against labeled examples. The modular Streamlit structure keeps scanning, segregation, reporting, and analytics independently extensible. The work connects software implementation with practical community waste workflows.</w:t>
-      </w:r>
-    </w:p>
-    <w:p>
-      <w:pPr>
-        <w:pStyle w:val="Heading2"/>
-        <w:rPr>
-          <w:rFonts w:ascii="Times New Roman" w:hAnsi="Times New Roman" w:eastAsia="Times New Roman" w:cs="Times New Roman"/>
-        </w:rPr>
-      </w:pPr>
-      <w:r>
-        <w:rPr>
-          <w:rFonts w:ascii="Times New Roman" w:hAnsi="Times New Roman" w:eastAsia="Times New Roman" w:cs="Times New Roman"/>
+          <w:rFonts w:ascii="Aptos" w:hAnsi="Aptos" w:eastAsia="Times New Roman" w:cs="Times New Roman"/>
+          <w:b/>
+          <w:color w:val="1C5339"/>
+          <w:sz w:val="28"/>
         </w:rPr>
         <w:t>10</w:t>
       </w:r>
       <w:r>
         <w:rPr>
-          <w:rFonts w:ascii="Times New Roman" w:hAnsi="Times New Roman" w:eastAsia="Times New Roman" w:cs="Times New Roman"/>
+          <w:rFonts w:ascii="Aptos" w:hAnsi="Aptos" w:eastAsia="Times New Roman" w:cs="Times New Roman"/>
+          <w:b/>
+          <w:color w:val="1C5339"/>
+          <w:sz w:val="28"/>
         </w:rPr>
         <w:t>. Use of AI Tools Disclosure</w:t>
       </w:r>
@@ -3813,6 +4484,10 @@
       </w:r>
       <w:hyperlink r:id="rId7">
         <w:r>
+          <w:rPr>
+            <w:color w:val="0563C1"/>
+            <w:u w:val="single"/>
+          </w:rPr>
           <w:t>https://github.com/Aditisy/Waste-Vision-AI</w:t>
         </w:r>
       </w:hyperlink>
@@ -3827,6 +4502,12 @@
         <w:pStyle w:val="Heading1"/>
       </w:pPr>
       <w:r>
+        <w:rPr>
+          <w:rFonts w:ascii="Aptos" w:hAnsi="Aptos"/>
+          <w:b/>
+          <w:color w:val="1C5339"/>
+          <w:sz w:val="28"/>
+        </w:rPr>
         <w:t>Appendix A. Interface Evidence</w:t>
       </w:r>
     </w:p>
@@ -4101,12 +4782,40 @@
       </w:r>
     </w:p>
     <w:sectPr>
+      <w:footerReference w:type="default" r:id="rId14"/>
       <w:pgSz w:w="12240" w:h="15840" w:orient="portrait"/>
       <w:pgMar w:top="1440" w:right="1440" w:bottom="1440" w:left="1440" w:header="720" w:footer="720" w:gutter="0"/>
       <w:cols w:space="720"/>
     </w:sectPr>
   </w:body>
 </w:document>
+</file>
+
+<file path=word/footer1.xml><?xml version="1.0" encoding="utf-8"?>
+<w:ftr xmlns:m="http://schemas.openxmlformats.org/officeDocument/2006/math" xmlns:mc="http://schemas.openxmlformats.org/markup-compatibility/2006" xmlns:mo="http://schemas.microsoft.com/office/mac/office/2008/main" xmlns:mv="urn:schemas-microsoft-com:mac:vml" xmlns:o="urn:schemas-microsoft-com:office:office" xmlns:r="http://schemas.openxmlformats.org/officeDocument/2006/relationships" xmlns:v="urn:schemas-microsoft-com:vml" xmlns:w10="urn:schemas-microsoft-com:office:word" xmlns:w14="http://schemas.microsoft.com/office/word/2010/wordml" xmlns:w="http://schemas.openxmlformats.org/wordprocessingml/2006/main" xmlns:wne="http://schemas.microsoft.com/office/word/2006/wordml" xmlns:wp14="http://schemas.microsoft.com/office/word/2010/wordprocessingDrawing" xmlns:wp="http://schemas.openxmlformats.org/drawingml/2006/wordprocessingDrawing" xmlns:wpc="http://schemas.microsoft.com/office/word/2010/wordprocessingCanvas" xmlns:wpg="http://schemas.microsoft.com/office/word/2010/wordprocessingGroup" xmlns:wpi="http://schemas.microsoft.com/office/word/2010/wordprocessingInk" xmlns:wps="http://schemas.microsoft.com/office/word/2010/wordprocessingShape" mc:Ignorable="w14 wp14">
+  <w:p>
+    <w:pPr>
+      <w:pStyle w:val="Footer"/>
+      <w:jc w:val="center"/>
+    </w:pPr>
+    <w:r>
+      <w:rPr>
+        <w:rFonts w:ascii="Aptos" w:hAnsi="Aptos"/>
+        <w:color w:val="5A695F"/>
+        <w:sz w:val="18"/>
+      </w:rPr>
+      <w:t xml:space="preserve">Page </w:t>
+    </w:r>
+    <w:fldSimple w:instr="PAGE">
+      <w:r>
+        <w:rPr>
+          <w:sz w:val="18"/>
+        </w:rPr>
+        <w:t>1</w:t>
+      </w:r>
+    </w:fldSimple>
+  </w:p>
+</w:ftr>
 </file>
 
 <file path=word/numbering.xml><?xml version="1.0" encoding="utf-8"?>
@@ -4712,8 +5421,10 @@
       <w:outlineLvl w:val="0"/>
     </w:pPr>
     <w:rPr>
+      <w:rFonts w:ascii="Aptos" w:hAnsi="Aptos" w:cs="Aptos" w:eastAsia="Aptos"/>
       <w:b/>
-      <w:sz w:val="32"/>
+      <w:color w:val="1C5339"/>
+      <w:sz w:val="28"/>
     </w:rPr>
   </w:style>
   <w:style w:type="paragraph" w:styleId="Heading2">
@@ -4729,8 +5440,10 @@
       <w:outlineLvl w:val="1"/>
     </w:pPr>
     <w:rPr>
+      <w:rFonts w:ascii="Aptos" w:hAnsi="Aptos" w:cs="Aptos" w:eastAsia="Aptos"/>
       <w:b/>
-      <w:sz w:val="26"/>
+      <w:color w:val="1C5339"/>
+      <w:sz w:val="28"/>
     </w:rPr>
   </w:style>
   <w:style w:type="paragraph" w:styleId="Heading3">
@@ -4746,8 +5459,10 @@
       <w:outlineLvl w:val="2"/>
     </w:pPr>
     <w:rPr>
+      <w:rFonts w:ascii="Aptos" w:hAnsi="Aptos" w:cs="Aptos" w:eastAsia="Aptos"/>
       <w:b/>
-      <w:sz w:val="24"/>
+      <w:color w:val="1C5339"/>
+      <w:sz w:val="28"/>
     </w:rPr>
   </w:style>
   <w:style w:type="paragraph" w:styleId="Heading4">

</xml_diff>